<commit_message>
Lead the book proposal with Iida and Inohara’s credentials.
The sell is Cambridge and UTokyo embodied robotics/AI, plus Science Tokyo and the Central Council for Education, not the emotion-force label.

Co-authored-by: kohnoda-glitch <kohnoda-glitch@users.noreply.github.com>
</commit_message>
<xml_diff>
--- a/writing/drafts/book-proposal/出版企画書.docx
+++ b/writing/drafts/book-proposal/出版企画書.docx
@@ -74,6 +74,21 @@
           <w:color w:val="555555"/>
           <w:sz w:val="20"/>
         </w:rPr>
+        <w:t>売り：飯田（ケンブリッジ／東大・身体性ロボット・人工知能）× 猪原（東京科学大・中教審）</w:t>
+      </w:r>
+    </w:p>
+    <w:p>
+      <w:pPr>
+        <w:spacing w:after="80" w:before="0" w:lineRule="auto" w:line="324"/>
+        <w:jc w:val="center"/>
+      </w:pPr>
+      <w:r>
+        <w:rPr>
+          <w:rFonts w:ascii="Yu Mincho" w:hAnsi="Yu Mincho" w:eastAsia="Yu Mincho"/>
+          <w:b w:val="0"/>
+          <w:color w:val="555555"/>
+          <w:sz w:val="20"/>
+        </w:rPr>
         <w:t>2026年9月</w:t>
       </w:r>
     </w:p>
@@ -88,7 +103,109 @@
           <w:color w:val="1A365D"/>
           <w:sz w:val="30"/>
         </w:rPr>
-        <w:t>1. タイトル</w:t>
+        <w:t>1. 売り</w:t>
+      </w:r>
+    </w:p>
+    <w:p>
+      <w:pPr>
+        <w:spacing w:after="160" w:before="0" w:lineRule="auto" w:line="324"/>
+        <w:ind w:firstLine="397"/>
+      </w:pPr>
+      <w:r>
+        <w:rPr>
+          <w:rFonts w:ascii="Yu Mincho" w:hAnsi="Yu Mincho" w:eastAsia="Yu Mincho"/>
+          <w:b w:val="0"/>
+          <w:color w:val="222222"/>
+          <w:sz w:val="22"/>
+        </w:rPr>
+        <w:t>この本の売りは、概念の新しさではない。飯田史也と猪原健弘の経歴が、同じ本に乗ることである。</w:t>
+      </w:r>
+    </w:p>
+    <w:p>
+      <w:pPr>
+        <w:spacing w:after="120" w:before="200" w:lineRule="auto" w:line="324"/>
+      </w:pPr>
+      <w:r>
+        <w:rPr>
+          <w:rFonts w:ascii="Yu Mincho" w:hAnsi="Yu Mincho" w:eastAsia="Yu Mincho"/>
+          <w:b/>
+          <w:color w:val="1A365D"/>
+          <w:sz w:val="24"/>
+        </w:rPr>
+        <w:t>飯田史也——ケンブリッジ大学・東京大学（理系）。身体性ロボットと人工知能</w:t>
+      </w:r>
+    </w:p>
+    <w:p>
+      <w:pPr>
+        <w:spacing w:after="160" w:before="0" w:lineRule="auto" w:line="324"/>
+        <w:ind w:firstLine="397"/>
+      </w:pPr>
+      <w:r>
+        <w:rPr>
+          <w:rFonts w:ascii="Yu Mincho" w:hAnsi="Yu Mincho" w:eastAsia="Yu Mincho"/>
+          <w:b w:val="0"/>
+          <w:color w:val="222222"/>
+          <w:sz w:val="22"/>
+        </w:rPr>
+        <w:t>ケンブリッジ大学工学部のロボティクス教授であり、東京大学大学院工学系研究科の教授（精密工学）でもある。身体性ロボット、身体性AI、バイオインスパイアード・ロボティクスが専門である。理系の最前線にいる人間が、「AIには身体がない」と書く。BIRL（Bio-Inspired Robotics Laboratory）をケンブリッジと東京で主宰する。関連書に『世界最高峰の学び』。</w:t>
+      </w:r>
+    </w:p>
+    <w:p>
+      <w:pPr>
+        <w:spacing w:after="120" w:before="200" w:lineRule="auto" w:line="324"/>
+      </w:pPr>
+      <w:r>
+        <w:rPr>
+          <w:rFonts w:ascii="Yu Mincho" w:hAnsi="Yu Mincho" w:eastAsia="Yu Mincho"/>
+          <w:b/>
+          <w:color w:val="1A365D"/>
+          <w:sz w:val="24"/>
+        </w:rPr>
+        <w:t>猪原健弘——東京科学大学。中央教育審議会</w:t>
+      </w:r>
+    </w:p>
+    <w:p>
+      <w:pPr>
+        <w:spacing w:after="160" w:before="0" w:lineRule="auto" w:line="324"/>
+        <w:ind w:firstLine="397"/>
+      </w:pPr>
+      <w:r>
+        <w:rPr>
+          <w:rFonts w:ascii="Yu Mincho" w:hAnsi="Yu Mincho" w:eastAsia="Yu Mincho"/>
+          <w:b w:val="0"/>
+          <w:color w:val="222222"/>
+          <w:sz w:val="22"/>
+        </w:rPr>
+        <w:t>東京科学大学リベラルアーツ研究教育院の教授である。社会工学、意思決定、ゲーム理論、合意形成が専門である。中央教育審議会 初等中等教育分科会 教育課程部会 特別活動ワーキンググループ専門委員（2025年9月〜2027年3月）。日本の学校がすでに持っている「特別活動」の現場に、教育行政の側から立つ人間が、感情と集団の設計を書く。読者の中心を、親でもある大人に置ける理由がここにある。</w:t>
+      </w:r>
+    </w:p>
+    <w:p>
+      <w:pPr>
+        <w:spacing w:after="160" w:before="0" w:lineRule="auto" w:line="324"/>
+        <w:ind w:firstLine="397"/>
+      </w:pPr>
+      <w:r>
+        <w:rPr>
+          <w:rFonts w:ascii="Yu Mincho" w:hAnsi="Yu Mincho" w:eastAsia="Yu Mincho"/>
+          <w:b w:val="0"/>
+          <w:color w:val="222222"/>
+          <w:sz w:val="22"/>
+        </w:rPr>
+        <w:t>野田浩平は主著として、認知科学とリーダーシップ教育の側から二人をつなぐ。松岡良彦は共同発起人である。飯田・猪原の著者表記は本人と調整する。顔ぶれそのものが、すでに本書の理由である。</w:t>
+      </w:r>
+    </w:p>
+    <w:p>
+      <w:pPr>
+        <w:spacing w:after="160" w:before="320" w:lineRule="auto" w:line="324"/>
+      </w:pPr>
+      <w:r>
+        <w:rPr>
+          <w:rFonts w:ascii="Yu Mincho" w:hAnsi="Yu Mincho" w:eastAsia="Yu Mincho"/>
+          <w:b/>
+          <w:color w:val="1A365D"/>
+          <w:sz w:val="30"/>
+        </w:rPr>
+        <w:t>2. タイトル</w:t>
       </w:r>
     </w:p>
     <w:p>
@@ -339,7 +456,7 @@
           <w:color w:val="1A365D"/>
           <w:sz w:val="30"/>
         </w:rPr>
-        <w:t>2. 一枚で言うと</w:t>
+        <w:t>3. 一枚で言うと</w:t>
       </w:r>
     </w:p>
     <w:p>
@@ -442,7 +559,7 @@
           <w:color w:val="1A365D"/>
           <w:sz w:val="30"/>
         </w:rPr>
-        <w:t>3. なぜ今か</w:t>
+        <w:t>4. なぜ今か</w:t>
       </w:r>
     </w:p>
     <w:p>
@@ -501,7 +618,7 @@
           <w:color w:val="1A365D"/>
           <w:sz w:val="30"/>
         </w:rPr>
-        <w:t>4. 読者</w:t>
+        <w:t>5. 読者</w:t>
       </w:r>
     </w:p>
     <w:p>
@@ -590,7 +707,7 @@
           <w:color w:val="1A365D"/>
           <w:sz w:val="30"/>
         </w:rPr>
-        <w:t>5. 中心概念</w:t>
+        <w:t>6. 中心概念</w:t>
       </w:r>
     </w:p>
     <w:p>
@@ -797,7 +914,7 @@
           <w:color w:val="1A365D"/>
           <w:sz w:val="30"/>
         </w:rPr>
-        <w:t>6. 章構成</w:t>
+        <w:t>7. 章構成</w:t>
       </w:r>
     </w:p>
     <w:p>
@@ -1253,7 +1370,7 @@
           <w:color w:val="1A365D"/>
           <w:sz w:val="30"/>
         </w:rPr>
-        <w:t>7. 著者</w:t>
+        <w:t>8. 著者</w:t>
       </w:r>
     </w:p>
     <w:p>
@@ -1268,7 +1385,65 @@
           <w:color w:val="222222"/>
           <w:sz w:val="22"/>
         </w:rPr>
-        <w:t>認知科学、身体性AI、合意形成が、感情という一本の線で交わる。主著は野田。飯田・猪原は企画の当初からのメンバーであり、著者表記は本人と調整する。松岡は共同発起人であり、執筆の範囲はこれから決める。</w:t>
+        <w:t>売りは飯田と猪原の経歴である。主著は野田。著者表記は本人と調整する。松岡は共同発起人であり、執筆の範囲はこれから決める。</w:t>
+      </w:r>
+    </w:p>
+    <w:p>
+      <w:pPr>
+        <w:spacing w:after="120" w:before="200" w:lineRule="auto" w:line="324"/>
+      </w:pPr>
+      <w:r>
+        <w:rPr>
+          <w:rFonts w:ascii="Yu Mincho" w:hAnsi="Yu Mincho" w:eastAsia="Yu Mincho"/>
+          <w:b/>
+          <w:color w:val="1A365D"/>
+          <w:sz w:val="24"/>
+        </w:rPr>
+        <w:t>飯田史也</w:t>
+      </w:r>
+    </w:p>
+    <w:p>
+      <w:pPr>
+        <w:spacing w:after="160" w:before="0" w:lineRule="auto" w:line="324"/>
+        <w:ind w:firstLine="397"/>
+      </w:pPr>
+      <w:r>
+        <w:rPr>
+          <w:rFonts w:ascii="Yu Mincho" w:hAnsi="Yu Mincho" w:eastAsia="Yu Mincho"/>
+          <w:b w:val="0"/>
+          <w:color w:val="222222"/>
+          <w:sz w:val="22"/>
+        </w:rPr>
+        <w:t>ケンブリッジ大学工学部ロボティクス教授。東京大学大学院工学系研究科教授（精密工学）。理系。身体性ロボット、身体性AI、バイオインスパイアード・ロボティクス。BIRLをケンブリッジと東京で主宰。関連書に『世界最高峰の学び』。担当の目安：身体、予測、AIと人間の境界。著者表記は調整中。</w:t>
+      </w:r>
+    </w:p>
+    <w:p>
+      <w:pPr>
+        <w:spacing w:after="120" w:before="200" w:lineRule="auto" w:line="324"/>
+      </w:pPr>
+      <w:r>
+        <w:rPr>
+          <w:rFonts w:ascii="Yu Mincho" w:hAnsi="Yu Mincho" w:eastAsia="Yu Mincho"/>
+          <w:b/>
+          <w:color w:val="1A365D"/>
+          <w:sz w:val="24"/>
+        </w:rPr>
+        <w:t>猪原健弘</w:t>
+      </w:r>
+    </w:p>
+    <w:p>
+      <w:pPr>
+        <w:spacing w:after="160" w:before="0" w:lineRule="auto" w:line="324"/>
+        <w:ind w:firstLine="397"/>
+      </w:pPr>
+      <w:r>
+        <w:rPr>
+          <w:rFonts w:ascii="Yu Mincho" w:hAnsi="Yu Mincho" w:eastAsia="Yu Mincho"/>
+          <w:b w:val="0"/>
+          <w:color w:val="222222"/>
+          <w:sz w:val="22"/>
+        </w:rPr>
+        <w:t>東京科学大学リベラルアーツ研究教育院教授。中央教育審議会 初等中等教育分科会 教育課程部会 特別活動ワーキンググループ専門委員（2025年9月〜2027年3月）。社会工学、意思決定、ゲーム理論、合意形成。担当の目安：集団・社会、特別活動、合意形成。著者表記は調整中。</w:t>
       </w:r>
     </w:p>
     <w:p>
@@ -1311,64 +1486,6 @@
           <w:color w:val="1A365D"/>
           <w:sz w:val="24"/>
         </w:rPr>
-        <w:t>飯田史也</w:t>
-      </w:r>
-    </w:p>
-    <w:p>
-      <w:pPr>
-        <w:spacing w:after="160" w:before="0" w:lineRule="auto" w:line="324"/>
-        <w:ind w:firstLine="397"/>
-      </w:pPr>
-      <w:r>
-        <w:rPr>
-          <w:rFonts w:ascii="Yu Mincho" w:hAnsi="Yu Mincho" w:eastAsia="Yu Mincho"/>
-          <w:b w:val="0"/>
-          <w:color w:val="222222"/>
-          <w:sz w:val="22"/>
-        </w:rPr>
-        <w:t>ケンブリッジ大学工学部ロボティクス教授。東京大学大学院工学系研究科教授（精密工学）。BIRL（Bio-Inspired Robotics Laboratory）をケンブリッジと東京で主宰。身体性AI、バイオインスパイアード・ロボティクス。関連書に『世界最高峰の学び』。担当の目安：身体、予測、AIと人間の境界。著者表記は調整中。</w:t>
-      </w:r>
-    </w:p>
-    <w:p>
-      <w:pPr>
-        <w:spacing w:after="120" w:before="200" w:lineRule="auto" w:line="324"/>
-      </w:pPr>
-      <w:r>
-        <w:rPr>
-          <w:rFonts w:ascii="Yu Mincho" w:hAnsi="Yu Mincho" w:eastAsia="Yu Mincho"/>
-          <w:b/>
-          <w:color w:val="1A365D"/>
-          <w:sz w:val="24"/>
-        </w:rPr>
-        <w:t>猪原健弘</w:t>
-      </w:r>
-    </w:p>
-    <w:p>
-      <w:pPr>
-        <w:spacing w:after="160" w:before="0" w:lineRule="auto" w:line="324"/>
-        <w:ind w:firstLine="397"/>
-      </w:pPr>
-      <w:r>
-        <w:rPr>
-          <w:rFonts w:ascii="Yu Mincho" w:hAnsi="Yu Mincho" w:eastAsia="Yu Mincho"/>
-          <w:b w:val="0"/>
-          <w:color w:val="222222"/>
-          <w:sz w:val="22"/>
-        </w:rPr>
-        <w:t>東京科学大学リベラルアーツ研究教育院教授。社会工学、意思決定、ゲーム理論、合意形成。中央教育審議会 初等中等教育分科会 教育課程部会 特別活動ワーキンググループ専門委員（2025年9月〜2027年3月）。担当の目安：集団・社会、特別活動、合意形成。著者表記は調整中。</w:t>
-      </w:r>
-    </w:p>
-    <w:p>
-      <w:pPr>
-        <w:spacing w:after="120" w:before="200" w:lineRule="auto" w:line="324"/>
-      </w:pPr>
-      <w:r>
-        <w:rPr>
-          <w:rFonts w:ascii="Yu Mincho" w:hAnsi="Yu Mincho" w:eastAsia="Yu Mincho"/>
-          <w:b/>
-          <w:color w:val="1A365D"/>
-          <w:sz w:val="24"/>
-        </w:rPr>
         <w:t>松岡良彦（共同発起人）</w:t>
       </w:r>
     </w:p>
@@ -1398,7 +1515,7 @@
           <w:color w:val="1A365D"/>
           <w:sz w:val="30"/>
         </w:rPr>
-        <w:t>8. 仕様</w:t>
+        <w:t>9. 仕様</w:t>
       </w:r>
     </w:p>
     <w:p>

</xml_diff>

<commit_message>
Replace textbook chapter titles and list Matsuoka as a partner.
Hide definitional emotion-chapter headings, keep him as Noda’s business and research partner at the end of the author list, and cite the 2016 JCSS paper plus SPEA.

Co-authored-by: kohnoda-glitch <kohnoda-glitch@users.noreply.github.com>
</commit_message>
<xml_diff>
--- a/writing/drafts/book-proposal/出版企画書.docx
+++ b/writing/drafts/book-proposal/出版企画書.docx
@@ -59,7 +59,7 @@
           <w:color w:val="555555"/>
           <w:sz w:val="20"/>
         </w:rPr>
-        <w:t>野田浩平（主著）／飯田史也／猪原健弘　｜　共同発起人：松岡良彦</w:t>
+        <w:t>野田浩平（主著）／飯田史也／猪原健弘／松岡良彦</w:t>
       </w:r>
     </w:p>
     <w:p>
@@ -191,7 +191,7 @@
           <w:color w:val="222222"/>
           <w:sz w:val="22"/>
         </w:rPr>
-        <w:t>野田浩平は主著として、認知科学とリーダーシップ教育の側から二人をつなぐ。松岡良彦は共同発起人である。飯田・猪原の著者表記は本人と調整する。顔ぶれそのものが、すでに本書の理由である。</w:t>
+        <w:t>野田浩平は主著として、認知科学とリーダーシップ教育の側から二人をつなぐ。松岡良彦は、野田のビジネスと研究のパートナーであり、著者の末尾に置く。飯田・猪原の著者表記は本人と調整する。顔ぶれそのものが、すでに本書の理由である。</w:t>
       </w:r>
     </w:p>
     <w:p>
@@ -929,7 +929,7 @@
           <w:color w:val="222222"/>
           <w:sz w:val="22"/>
         </w:rPr>
-        <w:t>序章、本編5章、終章。各章の見出しは3つ。担当は現時点の目安である。</w:t>
+        <w:t>序章と5章と終章。見出しは、問いと現場の言葉にする。担当は現時点の目安である。</w:t>
       </w:r>
     </w:p>
     <w:p>
@@ -988,7 +988,7 @@
           <w:color w:val="222222"/>
           <w:sz w:val="22"/>
         </w:rPr>
-        <w:t>・本書の地図——5ステップと5層</w:t>
+        <w:t>・会うことを、設計し直す</w:t>
       </w:r>
     </w:p>
     <w:p>
@@ -1002,7 +1002,7 @@
           <w:color w:val="1A365D"/>
           <w:sz w:val="24"/>
         </w:rPr>
-        <w:t>第1章　感情とは何か——理性の敵ではなく、生存の情報システム（野田）</w:t>
+        <w:t>第1章　「感情的になるな」が、いちばん危ない（野田）</w:t>
       </w:r>
     </w:p>
     <w:p>
@@ -1017,7 +1017,7 @@
           <w:color w:val="222222"/>
           <w:sz w:val="22"/>
         </w:rPr>
-        <w:t>・「感情的にならないで」という大間違い</w:t>
+        <w:t>・ChatGPTに「部下の気持ち」を聞くな</w:t>
       </w:r>
     </w:p>
     <w:p>
@@ -1032,7 +1032,7 @@
           <w:color w:val="222222"/>
           <w:sz w:val="22"/>
         </w:rPr>
-        <w:t>・感情はノイズではなく、最速のフィルターである</w:t>
+        <w:t>・データは手段を選ぶ。何を大切にするかは、人が決める</w:t>
       </w:r>
     </w:p>
     <w:p>
@@ -1047,7 +1047,7 @@
           <w:color w:val="222222"/>
           <w:sz w:val="22"/>
         </w:rPr>
-        <w:t>・価値を決める感情、手段を選ぶ理性</w:t>
+        <w:t>・頭がいい人ほど、先に折れる</w:t>
       </w:r>
     </w:p>
     <w:p>
@@ -1061,7 +1061,7 @@
           <w:color w:val="1A365D"/>
           <w:sz w:val="24"/>
         </w:rPr>
-        <w:t>第2章　感情は身体から始まる——AIにない身体知能（飯田）</w:t>
+        <w:t>第2章　AIは、お腹が空いて不機嫌になれない（飯田）</w:t>
       </w:r>
     </w:p>
     <w:p>
@@ -1076,7 +1076,7 @@
           <w:color w:val="222222"/>
           <w:sz w:val="22"/>
         </w:rPr>
-        <w:t>・ロボット研究者が、胃腸と心のつながりを見る理由</w:t>
+        <w:t>・ロボット研究者が、胃腸を見る理由</w:t>
       </w:r>
     </w:p>
     <w:p>
@@ -1091,7 +1091,7 @@
           <w:color w:val="222222"/>
           <w:sz w:val="22"/>
         </w:rPr>
-        <w:t>・内受容感覚——自分の身体の微細なシグナル</w:t>
+        <w:t>・画面の前の論理が、こぼしているもの</w:t>
       </w:r>
     </w:p>
     <w:p>
@@ -1106,7 +1106,7 @@
           <w:color w:val="222222"/>
           <w:sz w:val="22"/>
         </w:rPr>
-        <w:t>・予測と現実のずれが、学びと好奇心を起こす</w:t>
+        <w:t>・予測が外れたとき、人は学び始める</w:t>
       </w:r>
     </w:p>
     <w:p>
@@ -1120,7 +1120,7 @@
           <w:color w:val="1A365D"/>
           <w:sz w:val="24"/>
         </w:rPr>
-        <w:t>第3章　なぜ人は不機嫌になるのか——読み解き、整える（野田）</w:t>
+        <w:t>第3章　あの不機嫌の正体は、だいたい空腹である（野田）</w:t>
       </w:r>
     </w:p>
     <w:p>
@@ -1135,7 +1135,7 @@
           <w:color w:val="222222"/>
           <w:sz w:val="22"/>
         </w:rPr>
-        <w:t>・あの不機嫌の正体は、だいたい空腹か疲労である</w:t>
+        <w:t>・怒りと疲労を、取り違えない</w:t>
       </w:r>
     </w:p>
     <w:p>
@@ -1150,7 +1150,7 @@
           <w:color w:val="222222"/>
           <w:sz w:val="22"/>
         </w:rPr>
-        <w:t>・感情と行動の間に、0.5秒の余白をつくる</w:t>
+        <w:t>・0.5秒の余白をつくる</w:t>
       </w:r>
     </w:p>
     <w:p>
@@ -1179,7 +1179,7 @@
           <w:color w:val="1A365D"/>
           <w:sz w:val="24"/>
         </w:rPr>
-        <w:t>第4章　感情は人から人へ伝染する——家庭と組織の風土（野田×猪原）</w:t>
+        <w:t>第4章　リーダーの機嫌が、場の頭を悪くする（野田×猪原）</w:t>
       </w:r>
     </w:p>
     <w:p>
@@ -1194,7 +1194,7 @@
           <w:color w:val="222222"/>
           <w:sz w:val="22"/>
         </w:rPr>
-        <w:t>・リーダーの機嫌が、場の認知能力を決める</w:t>
+        <w:t>・「何でも言っていい」は、安全ではない</w:t>
       </w:r>
     </w:p>
     <w:p>
@@ -1209,7 +1209,7 @@
           <w:color w:val="222222"/>
           <w:sz w:val="22"/>
         </w:rPr>
-        <w:t>・心理的安全性は、「何でも言っていい場所」ではない</w:t>
+        <w:t>・会う、雑談、世話、失敗の共有</w:t>
       </w:r>
     </w:p>
     <w:p>
@@ -1224,7 +1224,7 @@
           <w:color w:val="222222"/>
           <w:sz w:val="22"/>
         </w:rPr>
-        <w:t>・会う、雑談、世話、失敗の共有——捨ててはいけない設計</w:t>
+        <w:t>・上機嫌の場は、設計できる</w:t>
       </w:r>
     </w:p>
     <w:p>
@@ -1238,7 +1238,7 @@
           <w:color w:val="1A365D"/>
           <w:sz w:val="24"/>
         </w:rPr>
-        <w:t>第5章　なぜ正しいことを言っても、人は動かないのか——集団と合意（猪原）</w:t>
+        <w:t>第5章　正しいことを言っても、人は動かない（猪原）</w:t>
       </w:r>
     </w:p>
     <w:p>
@@ -1268,7 +1268,7 @@
           <w:color w:val="222222"/>
           <w:sz w:val="22"/>
         </w:rPr>
-        <w:t>・SNSと群衆——理性を手放す仕組み</w:t>
+        <w:t>・SNSは、理性を手放させる</w:t>
       </w:r>
     </w:p>
     <w:p>
@@ -1283,7 +1283,7 @@
           <w:color w:val="222222"/>
           <w:sz w:val="22"/>
         </w:rPr>
-        <w:t>・対立の奥にある恐怖・屈辱・意地を、対話の設計に載せる</w:t>
+        <w:t>・対立の奥にある恐怖・屈辱・意地</w:t>
       </w:r>
     </w:p>
     <w:p>
@@ -1297,7 +1297,7 @@
           <w:color w:val="1A365D"/>
           <w:sz w:val="24"/>
         </w:rPr>
-        <w:t>終章　家庭・学校・企業から始める</w:t>
+        <w:t>終章　仕事のコストは下げろ。人間のコストは上げろ。</w:t>
       </w:r>
     </w:p>
     <w:p>
@@ -1312,7 +1312,7 @@
           <w:color w:val="222222"/>
           <w:sz w:val="22"/>
         </w:rPr>
-        <w:t>・親が先に、自分の感情を情報として扱う</w:t>
+        <w:t>・親が先に、自分の身体を読む</w:t>
       </w:r>
     </w:p>
     <w:p>
@@ -1327,7 +1327,7 @@
           <w:color w:val="222222"/>
           <w:sz w:val="22"/>
         </w:rPr>
-        <w:t>・学校は知識の前に、共に決める場をつくる</w:t>
+        <w:t>・学校は、共に決める場をつくる</w:t>
       </w:r>
     </w:p>
     <w:p>
@@ -1342,7 +1342,7 @@
           <w:color w:val="222222"/>
           <w:sz w:val="22"/>
         </w:rPr>
-        <w:t>・経営は、仕事のコストを下げ、人間のコストを上げる</w:t>
+        <w:t>・経営は、会いに行く</w:t>
       </w:r>
     </w:p>
     <w:p>
@@ -1385,7 +1385,7 @@
           <w:color w:val="222222"/>
           <w:sz w:val="22"/>
         </w:rPr>
-        <w:t>売りは飯田と猪原の経歴である。主著は野田。著者表記は本人と調整する。松岡は共同発起人であり、執筆の範囲はこれから決める。</w:t>
+        <w:t>売りは飯田と猪原の経歴である。主著は野田。著者表記は本人と調整する。松岡良彦は、野田のビジネスと研究のパートナーとして、著者の末尾に置く。</w:t>
       </w:r>
     </w:p>
     <w:p>
@@ -1486,7 +1486,7 @@
           <w:color w:val="1A365D"/>
           <w:sz w:val="24"/>
         </w:rPr>
-        <w:t>松岡良彦（共同発起人）</w:t>
+        <w:t>松岡良彦（ビジネス・研究パートナー）</w:t>
       </w:r>
     </w:p>
     <w:p>
@@ -1501,7 +1501,7 @@
           <w:color w:val="222222"/>
           <w:sz w:val="22"/>
         </w:rPr>
-        <w:t>出版社の「プロデューサー」ではない。この企画を動かす共同発起人である。株式会社Ducks and Drakes。フィリピン・ドゥマゲテの Starting Point English Academy（SPEA）。日本初の子ども向けオンライン英会話の共同創業、体験型の英語学習（RLE）で野田と協働した。肩書の書き方と執筆の有無は、本人と決める。</w:t>
+        <w:t>野田のビジネスと研究のパートナーである。株式会社Ducks and Drakes。フィリピン・ドゥマゲテの Starting Point English Academy（SPEA）で、子どもの英語教育を現場でともに見ていた。2016年、日本認知科学会第33回大会で野田と共著発表（第二言語としての英語学習における Real Life Experience 法の提案）。出版社の「プロデューサー」ではない。肩書の書き方と執筆の有無は、本人と決める。</w:t>
       </w:r>
     </w:p>
     <w:p>

</xml_diff>

<commit_message>
Drop the sell block and frame the book around multiple intelligences.
Remove producer copy, stop assigning chapter 3 to Noda, and treat Harvard/MIT/UN as already-familiar rather than news.

Co-authored-by: kohnoda-glitch <kohnoda-glitch@users.noreply.github.com>
</commit_message>
<xml_diff>
--- a/writing/drafts/book-proposal/出版企画書.docx
+++ b/writing/drafts/book-proposal/出版企画書.docx
@@ -74,21 +74,6 @@
           <w:color w:val="555555"/>
           <w:sz w:val="20"/>
         </w:rPr>
-        <w:t>売り：飯田（ケンブリッジ／東大・身体性ロボット・人工知能）× 猪原（東京科学大・中教審）</w:t>
-      </w:r>
-    </w:p>
-    <w:p>
-      <w:pPr>
-        <w:spacing w:after="80" w:before="0" w:lineRule="auto" w:line="324"/>
-        <w:jc w:val="center"/>
-      </w:pPr>
-      <w:r>
-        <w:rPr>
-          <w:rFonts w:ascii="Yu Mincho" w:hAnsi="Yu Mincho" w:eastAsia="Yu Mincho"/>
-          <w:b w:val="0"/>
-          <w:color w:val="555555"/>
-          <w:sz w:val="20"/>
-        </w:rPr>
         <w:t>2026年9月</w:t>
       </w:r>
     </w:p>
@@ -103,7 +88,7 @@
           <w:color w:val="1A365D"/>
           <w:sz w:val="30"/>
         </w:rPr>
-        <w:t>1. 売り</w:t>
+        <w:t>1. タイトル</w:t>
       </w:r>
     </w:p>
     <w:p>
@@ -118,109 +103,7 @@
           <w:color w:val="222222"/>
           <w:sz w:val="22"/>
         </w:rPr>
-        <w:t>この本の売りは、概念の新しさではない。飯田史也と猪原健弘の経歴が、同じ本に乗ることである。</w:t>
-      </w:r>
-    </w:p>
-    <w:p>
-      <w:pPr>
-        <w:spacing w:after="120" w:before="200" w:lineRule="auto" w:line="324"/>
-      </w:pPr>
-      <w:r>
-        <w:rPr>
-          <w:rFonts w:ascii="Yu Mincho" w:hAnsi="Yu Mincho" w:eastAsia="Yu Mincho"/>
-          <w:b/>
-          <w:color w:val="1A365D"/>
-          <w:sz w:val="24"/>
-        </w:rPr>
-        <w:t>飯田史也——ケンブリッジ大学・東京大学（理系）。身体性ロボットと人工知能</w:t>
-      </w:r>
-    </w:p>
-    <w:p>
-      <w:pPr>
-        <w:spacing w:after="160" w:before="0" w:lineRule="auto" w:line="324"/>
-        <w:ind w:firstLine="397"/>
-      </w:pPr>
-      <w:r>
-        <w:rPr>
-          <w:rFonts w:ascii="Yu Mincho" w:hAnsi="Yu Mincho" w:eastAsia="Yu Mincho"/>
-          <w:b w:val="0"/>
-          <w:color w:val="222222"/>
-          <w:sz w:val="22"/>
-        </w:rPr>
-        <w:t>ケンブリッジ大学工学部のロボティクス教授であり、東京大学大学院工学系研究科の教授（精密工学）でもある。身体性ロボット、身体性AI、バイオインスパイアード・ロボティクスが専門である。理系の最前線にいる人間が、「AIには身体がない」と書く。BIRL（Bio-Inspired Robotics Laboratory）をケンブリッジと東京で主宰する。関連書に『世界最高峰の学び』。</w:t>
-      </w:r>
-    </w:p>
-    <w:p>
-      <w:pPr>
-        <w:spacing w:after="120" w:before="200" w:lineRule="auto" w:line="324"/>
-      </w:pPr>
-      <w:r>
-        <w:rPr>
-          <w:rFonts w:ascii="Yu Mincho" w:hAnsi="Yu Mincho" w:eastAsia="Yu Mincho"/>
-          <w:b/>
-          <w:color w:val="1A365D"/>
-          <w:sz w:val="24"/>
-        </w:rPr>
-        <w:t>猪原健弘——東京科学大学。中央教育審議会</w:t>
-      </w:r>
-    </w:p>
-    <w:p>
-      <w:pPr>
-        <w:spacing w:after="160" w:before="0" w:lineRule="auto" w:line="324"/>
-        <w:ind w:firstLine="397"/>
-      </w:pPr>
-      <w:r>
-        <w:rPr>
-          <w:rFonts w:ascii="Yu Mincho" w:hAnsi="Yu Mincho" w:eastAsia="Yu Mincho"/>
-          <w:b w:val="0"/>
-          <w:color w:val="222222"/>
-          <w:sz w:val="22"/>
-        </w:rPr>
-        <w:t>東京科学大学リベラルアーツ研究教育院の教授である。社会工学、意思決定、ゲーム理論、合意形成が専門である。中央教育審議会 初等中等教育分科会 教育課程部会 特別活動ワーキンググループ専門委員（2025年9月〜2027年3月）。日本の学校がすでに持っている「特別活動」の現場に、教育行政の側から立つ人間が、感情と集団の設計を書く。読者の中心を、親でもある大人に置ける理由がここにある。</w:t>
-      </w:r>
-    </w:p>
-    <w:p>
-      <w:pPr>
-        <w:spacing w:after="160" w:before="0" w:lineRule="auto" w:line="324"/>
-        <w:ind w:firstLine="397"/>
-      </w:pPr>
-      <w:r>
-        <w:rPr>
-          <w:rFonts w:ascii="Yu Mincho" w:hAnsi="Yu Mincho" w:eastAsia="Yu Mincho"/>
-          <w:b w:val="0"/>
-          <w:color w:val="222222"/>
-          <w:sz w:val="22"/>
-        </w:rPr>
-        <w:t>野田浩平は主著として、認知科学とリーダーシップ教育の側から二人をつなぐ。松岡良彦は、野田のビジネスと研究のパートナーであり、著者の末尾に置く。飯田・猪原の著者表記は本人と調整する。顔ぶれそのものが、すでに本書の理由である。</w:t>
-      </w:r>
-    </w:p>
-    <w:p>
-      <w:pPr>
-        <w:spacing w:after="160" w:before="320" w:lineRule="auto" w:line="324"/>
-      </w:pPr>
-      <w:r>
-        <w:rPr>
-          <w:rFonts w:ascii="Yu Mincho" w:hAnsi="Yu Mincho" w:eastAsia="Yu Mincho"/>
-          <w:b/>
-          <w:color w:val="1A365D"/>
-          <w:sz w:val="30"/>
-        </w:rPr>
-        <w:t>2. タイトル</w:t>
-      </w:r>
-    </w:p>
-    <w:p>
-      <w:pPr>
-        <w:spacing w:after="160" w:before="0" w:lineRule="auto" w:line="324"/>
-        <w:ind w:firstLine="397"/>
-      </w:pPr>
-      <w:r>
-        <w:rPr>
-          <w:rFonts w:ascii="Yu Mincho" w:hAnsi="Yu Mincho" w:eastAsia="Yu Mincho"/>
-          <w:b w:val="0"/>
-          <w:color w:val="222222"/>
-          <w:sz w:val="22"/>
-        </w:rPr>
-        <w:t>本書の中身は、感情を情報として読み、行動を自分で選び直す力である。それを「感情力」と呼ぶこともできる。ただしその語は、すでに手垢がついており、書店の棚ではパンチに欠ける。そこで表紙の第一案は、次のコピーにする。</w:t>
+        <w:t>表紙の第一案は、次のコピーにする。「感情力」は手垢がついており、棚の第一案にはしない。中身の背骨は感情の単一理論ではなく、ハワード・ガードナーの多重知能である。</w:t>
       </w:r>
     </w:p>
     <w:p>
@@ -456,7 +339,7 @@
           <w:color w:val="1A365D"/>
           <w:sz w:val="30"/>
         </w:rPr>
-        <w:t>3. 一枚で言うと</w:t>
+        <w:t>2. 一枚で言うと</w:t>
       </w:r>
     </w:p>
     <w:p>
@@ -471,7 +354,7 @@
           <w:color w:val="222222"/>
           <w:sz w:val="22"/>
         </w:rPr>
-        <w:t>AIとSTEMが仕事のコミュニケーションを速く安くするほど、残るのは「感じる・読み解く・言葉にする・整える・共に決める」という人間側の力である。本書はそれを、身体→予測→意味→関係→集団・社会の5層で、親・教師・経営者に渡す。</w:t>
+        <w:t>AIが、いわゆる「頭のよさ」を安くした。残るのは、身体、対人、内面、現場で使う言葉といった、別種の知能である。本書はそれを、ガードナーの多重知能を地図にして、親・教師・経営者に渡す。感情はその一部であり、本の全部ではない。</w:t>
       </w:r>
     </w:p>
     <w:p>
@@ -545,7 +428,7 @@
           <w:color w:val="222222"/>
           <w:sz w:val="22"/>
         </w:rPr>
-        <w:t>・STEMの先に残るのは、感情を扱う知性である。</w:t>
+        <w:t>・STEMの先に残るのは、頭以外の知能である。</w:t>
       </w:r>
     </w:p>
     <w:p>
@@ -559,7 +442,7 @@
           <w:color w:val="1A365D"/>
           <w:sz w:val="30"/>
         </w:rPr>
-        <w:t>4. なぜ今か</w:t>
+        <w:t>3. なぜ今か</w:t>
       </w:r>
     </w:p>
     <w:p>
@@ -589,7 +472,7 @@
           <w:color w:val="222222"/>
           <w:sz w:val="22"/>
         </w:rPr>
-        <w:t>欧米では、工業化社会の延長線上にあるタスク処理型のエリート教育は限界だ、という議論がMIT・ハーバード・国連周辺で動いている。日本の親・教師・リーダーには、それが抽象的すぎて現場に落ちない。本書は、その潮流を日本の家庭・学校・職場の実装に落とすための一冊である。AIやSTEMを否定しない。エンジンを動かす操縦席が、人間側の力である。</w:t>
+        <w:t>身体をいたわる、人と話す、内面を見る。こうした知性は、多重知能をはじめ、以前から言われてきた。ハーバード、MIT、国連の名を出せば新しく見えるが、いまさら新しい話にはならない。本書は、その再発見を繰り返さない。書くのは、AIが論理と知識を安くしたあとに、日本の家庭・学校・職場で、どの知能をどう育てるかである。</w:t>
       </w:r>
     </w:p>
     <w:p>
@@ -604,7 +487,7 @@
           <w:color w:val="222222"/>
           <w:sz w:val="22"/>
         </w:rPr>
-        <w:t>この本は、メンタルヘルスの診断書ではない。組織と学びの現場で、感情を扱う力を設計する本である。</w:t>
+        <w:t>この本は、メンタルヘルスの診断書ではない。学びと現場の設計の本である。</w:t>
       </w:r>
     </w:p>
     <w:p>
@@ -618,7 +501,7 @@
           <w:color w:val="1A365D"/>
           <w:sz w:val="30"/>
         </w:rPr>
-        <w:t>5. 読者</w:t>
+        <w:t>4. 読者</w:t>
       </w:r>
     </w:p>
     <w:p>
@@ -663,7 +546,7 @@
           <w:color w:val="222222"/>
           <w:sz w:val="22"/>
         </w:rPr>
-        <w:t>・教師・学校関係者——特別活動・学級経営・探究の「感情の扱い方」。</w:t>
+        <w:t>・教師・学校関係者——特別活動・学級経営・探究。人と合意の作り方。</w:t>
       </w:r>
     </w:p>
     <w:p>
@@ -693,7 +576,7 @@
           <w:color w:val="222222"/>
           <w:sz w:val="22"/>
         </w:rPr>
-        <w:t>若手には「昭和」という言葉のアレルギーがある。だから昭和は入口のコピーに使い、本文は5層で読ませる。タイトルは第一案以外でもよい。中身は変えない。</w:t>
+        <w:t>若手には「昭和」という言葉のアレルギーがある。だから昭和は入口のコピーに使い、本文は多重知能で読ませる。タイトルは第一案以外でもよい。中身は変えない。</w:t>
       </w:r>
     </w:p>
     <w:p>
@@ -707,7 +590,7 @@
           <w:color w:val="1A365D"/>
           <w:sz w:val="30"/>
         </w:rPr>
-        <w:t>6. 中心概念</w:t>
+        <w:t>5. 中心概念</w:t>
       </w:r>
     </w:p>
     <w:p>
@@ -722,7 +605,22 @@
           <w:color w:val="222222"/>
           <w:sz w:val="22"/>
         </w:rPr>
-        <w:t>ここで扱う力は、感情に流される力でも、抑え込む技術でもない。感情を情報として読み、行動を自分で選び直す力である。</w:t>
+        <w:t>3名、ないし4名をつなぐのは、感情の教科書ではない。ハワード・ガードナーの多重知能（Multiple Intelligences）である。いわゆるIQやSTEMで測る知能は、知能の一種にすぎない。身体、対人、内面、言語、音楽、空間など、別の知能がある。</w:t>
+      </w:r>
+    </w:p>
+    <w:p>
+      <w:pPr>
+        <w:spacing w:after="160" w:before="0" w:lineRule="auto" w:line="324"/>
+        <w:ind w:firstLine="397"/>
+      </w:pPr>
+      <w:r>
+        <w:rPr>
+          <w:rFonts w:ascii="Yu Mincho" w:hAnsi="Yu Mincho" w:eastAsia="Yu Mincho"/>
+          <w:b w:val="0"/>
+          <w:color w:val="222222"/>
+          <w:sz w:val="22"/>
+        </w:rPr>
+        <w:t>顔ぶれは、その地図の上に乗る。飯田は身体とものづくり（身体性ロボット・人工知能）。猪原は人と集団で決めること（合意形成・特別活動）。野田は内面と学びの設計（認知科学・リーダーシップ教育）。松岡は言語と現場の学び（RLE、子どもの英語教育）。感情や機嫌は、内面と対人の知能の話として出てくる。本の全部を感情に還元しない。</w:t>
       </w:r>
     </w:p>
     <w:p>
@@ -736,7 +634,7 @@
           <w:color w:val="1A365D"/>
           <w:sz w:val="24"/>
         </w:rPr>
-        <w:t>5つのステップ</w:t>
+        <w:t>現場で使う地図（感情に還元しない）</w:t>
       </w:r>
     </w:p>
     <w:p>
@@ -751,7 +649,7 @@
           <w:color w:val="222222"/>
           <w:sz w:val="22"/>
         </w:rPr>
-        <w:t>・感じる——身体に生じている変化や、まだ言葉になっていない感覚に気づく。</w:t>
+        <w:t>・身体を読む——空腹、疲労、呼吸。頭の前にある。</w:t>
       </w:r>
     </w:p>
     <w:p>
@@ -766,7 +664,7 @@
           <w:color w:val="222222"/>
           <w:sz w:val="22"/>
         </w:rPr>
-        <w:t>・読み解く——怒り、不安、空腹、疲労、嫉妬を混同せず、背景を理解する。</w:t>
+        <w:t>・人と場を読む——表情、空気、期待。一人では完結しない。</w:t>
       </w:r>
     </w:p>
     <w:p>
@@ -781,7 +679,7 @@
           <w:color w:val="222222"/>
           <w:sz w:val="22"/>
         </w:rPr>
-        <w:t>・言葉にする——攻撃や沈黙ではなく、共有可能な情報として伝える。</w:t>
+        <w:t>・言葉にする——攻撃でも沈黙でもなく、共有できる形にする。</w:t>
       </w:r>
     </w:p>
     <w:p>
@@ -796,7 +694,7 @@
           <w:color w:val="222222"/>
           <w:sz w:val="22"/>
         </w:rPr>
-        <w:t>・整える——抑圧せず、感情と行動の間に選択肢をつくる。</w:t>
+        <w:t>・余白をつくる——衝動と行動のあいだに、選択肢を置く。</w:t>
       </w:r>
     </w:p>
     <w:p>
@@ -811,7 +709,7 @@
           <w:color w:val="222222"/>
           <w:sz w:val="22"/>
         </w:rPr>
-        <w:t>・共に決める——異なる感情や価値観を持つ人々が、対話し、合意し、行動する。</w:t>
+        <w:t>・共に決める——違う知能、違う価値観のまま、合意に乗せる。</w:t>
       </w:r>
     </w:p>
     <w:p>
@@ -914,7 +812,7 @@
           <w:color w:val="1A365D"/>
           <w:sz w:val="30"/>
         </w:rPr>
-        <w:t>7. 章構成</w:t>
+        <w:t>6. 章構成</w:t>
       </w:r>
     </w:p>
     <w:p>
@@ -929,7 +827,7 @@
           <w:color w:val="222222"/>
           <w:sz w:val="22"/>
         </w:rPr>
-        <w:t>序章と5章と終章。見出しは、問いと現場の言葉にする。担当は現時点の目安である。</w:t>
+        <w:t>序章と5章と終章。見出しは、問いと現場の言葉にする。章の担当は、これから組む。第3章を誰が書くかは、いまは決めない。</w:t>
       </w:r>
     </w:p>
     <w:p>
@@ -1002,7 +900,7 @@
           <w:color w:val="1A365D"/>
           <w:sz w:val="24"/>
         </w:rPr>
-        <w:t>第1章　「感情的になるな」が、いちばん危ない（野田）</w:t>
+        <w:t>第1章　「感情的になるな」が、いちばん危ない</w:t>
       </w:r>
     </w:p>
     <w:p>
@@ -1061,7 +959,7 @@
           <w:color w:val="1A365D"/>
           <w:sz w:val="24"/>
         </w:rPr>
-        <w:t>第2章　AIは、お腹が空いて不機嫌になれない（飯田）</w:t>
+        <w:t>第2章　AIは、お腹が空いて不機嫌になれない</w:t>
       </w:r>
     </w:p>
     <w:p>
@@ -1120,7 +1018,7 @@
           <w:color w:val="1A365D"/>
           <w:sz w:val="24"/>
         </w:rPr>
-        <w:t>第3章　あの不機嫌の正体は、だいたい空腹である（野田）</w:t>
+        <w:t>第3章　あの不機嫌の正体は、だいたい空腹である</w:t>
       </w:r>
     </w:p>
     <w:p>
@@ -1179,7 +1077,7 @@
           <w:color w:val="1A365D"/>
           <w:sz w:val="24"/>
         </w:rPr>
-        <w:t>第4章　リーダーの機嫌が、場の頭を悪くする（野田×猪原）</w:t>
+        <w:t>第4章　リーダーの機嫌が、場の頭を悪くする</w:t>
       </w:r>
     </w:p>
     <w:p>
@@ -1238,7 +1136,7 @@
           <w:color w:val="1A365D"/>
           <w:sz w:val="24"/>
         </w:rPr>
-        <w:t>第5章　正しいことを言っても、人は動かない（猪原）</w:t>
+        <w:t>第5章　正しいことを言っても、人は動かない</w:t>
       </w:r>
     </w:p>
     <w:p>
@@ -1370,7 +1268,7 @@
           <w:color w:val="1A365D"/>
           <w:sz w:val="30"/>
         </w:rPr>
-        <w:t>8. 著者</w:t>
+        <w:t>7. 著者</w:t>
       </w:r>
     </w:p>
     <w:p>
@@ -1385,7 +1283,7 @@
           <w:color w:val="222222"/>
           <w:sz w:val="22"/>
         </w:rPr>
-        <w:t>売りは飯田と猪原の経歴である。主著は野田。著者表記は本人と調整する。松岡良彦は、野田のビジネスと研究のパートナーとして、著者の末尾に置く。</w:t>
+        <w:t>主著は野田。飯田・猪原・松岡が同じ本に乗る。つなぐのは多重知能である。著者表記は本人と調整する。松岡良彦は、野田のビジネスと研究のパートナーとして、著者の末尾に置く。</w:t>
       </w:r>
     </w:p>
     <w:p>
@@ -1414,7 +1312,7 @@
           <w:color w:val="222222"/>
           <w:sz w:val="22"/>
         </w:rPr>
-        <w:t>ケンブリッジ大学工学部ロボティクス教授。東京大学大学院工学系研究科教授（精密工学）。理系。身体性ロボット、身体性AI、バイオインスパイアード・ロボティクス。BIRLをケンブリッジと東京で主宰。関連書に『世界最高峰の学び』。担当の目安：身体、予測、AIと人間の境界。著者表記は調整中。</w:t>
+        <w:t>ケンブリッジ大学工学部ロボティクス教授。東京大学大学院工学系研究科教授（精密工学）。理系。身体性ロボット、身体性AI、バイオインスパイアード・ロボティクス。BIRLをケンブリッジと東京で主宰。関連書に『世界最高峰の学び』。著者表記は調整中。</w:t>
       </w:r>
     </w:p>
     <w:p>
@@ -1443,7 +1341,7 @@
           <w:color w:val="222222"/>
           <w:sz w:val="22"/>
         </w:rPr>
-        <w:t>東京科学大学リベラルアーツ研究教育院教授。中央教育審議会 初等中等教育分科会 教育課程部会 特別活動ワーキンググループ専門委員（2025年9月〜2027年3月）。社会工学、意思決定、ゲーム理論、合意形成。担当の目安：集団・社会、特別活動、合意形成。著者表記は調整中。</w:t>
+        <w:t>東京科学大学リベラルアーツ研究教育院教授。中央教育審議会 初等中等教育分科会 教育課程部会 特別活動ワーキンググループ専門委員（2025年9月〜2027年3月）。社会工学、意思決定、ゲーム理論、合意形成。著者表記は調整中。</w:t>
       </w:r>
     </w:p>
     <w:p>
@@ -1472,7 +1370,7 @@
           <w:color w:val="222222"/>
           <w:sz w:val="22"/>
         </w:rPr>
-        <w:t>認知科学者（博士）。株式会社ココロラボ代表取締役。グロービス経営大学院専任教員。MIT IDEAS Asia Pacific Regional Faculty。認知・身体・組織のあいだで感情を扱い、リーダーシップ教育と学びの更新に取り組む。担当の目安：感じる／読み解く／整える、組織の感情、序章と終章の通し。</w:t>
+        <w:t>認知科学者（博士）。株式会社ココロラボ代表取締役。グロービス経営大学院専任教員。MIT IDEAS Asia Pacific Regional Faculty。認知科学とリーダーシップ教育から、多重知能の側で学びを設計する。</w:t>
       </w:r>
     </w:p>
     <w:p>
@@ -1501,7 +1399,7 @@
           <w:color w:val="222222"/>
           <w:sz w:val="22"/>
         </w:rPr>
-        <w:t>野田のビジネスと研究のパートナーである。株式会社Ducks and Drakes。フィリピン・ドゥマゲテの Starting Point English Academy（SPEA）で、子どもの英語教育を現場でともに見ていた。2016年、日本認知科学会第33回大会で野田と共著発表（第二言語としての英語学習における Real Life Experience 法の提案）。出版社の「プロデューサー」ではない。肩書の書き方と執筆の有無は、本人と決める。</w:t>
+        <w:t>野田のビジネスと研究のパートナーである。株式会社Ducks and Drakes。フィリピン・ドゥマゲテの Starting Point English Academy（SPEA）で、子どもの英語教育を現場でともに見ていた。2016年、日本認知科学会第33回大会で野田と共著発表（第二言語としての英語学習における Real Life Experience 法の提案）。</w:t>
       </w:r>
     </w:p>
     <w:p>
@@ -1515,7 +1413,7 @@
           <w:color w:val="1A365D"/>
           <w:sz w:val="30"/>
         </w:rPr>
-        <w:t>9. 仕様</w:t>
+        <w:t>8. 仕様</w:t>
       </w:r>
     </w:p>
     <w:p>

</xml_diff>

<commit_message>
Tone down multiple intelligences and blur the elite-education name-drop.
Treat MI as one map of broader capability, keep emotion in the frame, and speak of management education, pedagogy, and elite schooling without listing Harvard, MIT, or the UN.

Co-authored-by: kohnoda-glitch <kohnoda-glitch@users.noreply.github.com>
</commit_message>
<xml_diff>
--- a/writing/drafts/book-proposal/出版企画書.docx
+++ b/writing/drafts/book-proposal/出版企画書.docx
@@ -103,7 +103,7 @@
           <w:color w:val="222222"/>
           <w:sz w:val="22"/>
         </w:rPr>
-        <w:t>表紙の第一案は、次のコピーにする。「感情力」は手垢がついており、棚の第一案にはしない。中身の背骨は感情の単一理論ではなく、ハワード・ガードナーの多重知能である。</w:t>
+        <w:t>表紙の第一案は、次のコピーにする。「感情力」は手垢がついており、棚の第一案にはしない。中身が扱うのは、頭のよさだけではない包括的な能力である。多重知能は、その代表的な見取り図のひとつにすぎない。感情も、その一部として残る。</w:t>
       </w:r>
     </w:p>
     <w:p>
@@ -354,7 +354,7 @@
           <w:color w:val="222222"/>
           <w:sz w:val="22"/>
         </w:rPr>
-        <w:t>AIが、いわゆる「頭のよさ」を安くした。残るのは、身体、対人、内面、現場で使う言葉といった、別種の知能である。本書はそれを、ガードナーの多重知能を地図にして、親・教師・経営者に渡す。感情はその一部であり、本の全部ではない。</w:t>
+        <w:t>AIが、いわゆる「頭のよさ」を安くした。残るのは、身体、感情、対人、現場で使う言葉といった、包括的な能力である。本書はそれを、親・教師・経営者に渡す。多重知能は地図のひとつであり、本の看板ではない。感情を捨てる本でもない。</w:t>
       </w:r>
     </w:p>
     <w:p>
@@ -428,7 +428,7 @@
           <w:color w:val="222222"/>
           <w:sz w:val="22"/>
         </w:rPr>
-        <w:t>・STEMの先に残るのは、頭以外の知能である。</w:t>
+        <w:t>・STEMの先に残るのは、頭のよさ以外の能力である。感情も、その一部である。</w:t>
       </w:r>
     </w:p>
     <w:p>
@@ -472,7 +472,7 @@
           <w:color w:val="222222"/>
           <w:sz w:val="22"/>
         </w:rPr>
-        <w:t>身体をいたわる、人と話す、内面を見る。こうした知性は、多重知能をはじめ、以前から言われてきた。ハーバード、MIT、国連の名を出せば新しく見えるが、いまさら新しい話にはならない。本書は、その再発見を繰り返さない。書くのは、AIが論理と知識を安くしたあとに、日本の家庭・学校・職場で、どの知能をどう育てるかである。</w:t>
+        <w:t>身体、感情、人と場。こうした力は、経営教育の議論でも長く言われてきた。教育学でも、エリート教育の見直しでも、以前から出ている。特定の大学や国際機関の名前を並べれば新しく見えるが、新しさはそこではない。本書は、その再発見を繰り返さない。書くのは、AIが論理と知識を安くしたあとに、日本の家庭・学校・職場で、どの力をどう育てるかである。</w:t>
       </w:r>
     </w:p>
     <w:p>
@@ -576,7 +576,7 @@
           <w:color w:val="222222"/>
           <w:sz w:val="22"/>
         </w:rPr>
-        <w:t>若手には「昭和」という言葉のアレルギーがある。だから昭和は入口のコピーに使い、本文は多重知能で読ませる。タイトルは第一案以外でもよい。中身は変えない。</w:t>
+        <w:t>若手には「昭和」という言葉のアレルギーがある。だから昭和は入口のコピーに使い、本文は包括的な能力——身体、感情、人と場——で読ませる。タイトルは第一案以外でもよい。中身は変えない。</w:t>
       </w:r>
     </w:p>
     <w:p>
@@ -605,7 +605,7 @@
           <w:color w:val="222222"/>
           <w:sz w:val="22"/>
         </w:rPr>
-        <w:t>3名、ないし4名をつなぐのは、感情の教科書ではない。ハワード・ガードナーの多重知能（Multiple Intelligences）である。いわゆるIQやSTEMで測る知能は、知能の一種にすぎない。身体、対人、内面、言語、音楽、空間など、別の知能がある。</w:t>
+        <w:t>3名、ないし4名をつなぐのは、感情の教科書でも、ひとつの理論の解説書でもない。頭のよさ以外の、包括的な能力である。多重知能は、その代表的な整理のひとつにすぎない。身体、対人、内面、言語、感情。IQやSTEMで測る力は、その一部でしかない。</w:t>
       </w:r>
     </w:p>
     <w:p>
@@ -620,7 +620,7 @@
           <w:color w:val="222222"/>
           <w:sz w:val="22"/>
         </w:rPr>
-        <w:t>顔ぶれは、その地図の上に乗る。飯田は身体とものづくり（身体性ロボット・人工知能）。猪原は人と集団で決めること（合意形成・特別活動）。野田は内面と学びの設計（認知科学・リーダーシップ教育）。松岡は言語と現場の学び（RLE、子どもの英語教育）。感情や機嫌は、内面と対人の知能の話として出てくる。本の全部を感情に還元しない。</w:t>
+        <w:t>顔ぶれは、その現場にいる。飯田は身体とものづくり（身体性ロボット・人工知能）。猪原は人と集団で決めること（合意形成・特別活動）。野田は認知科学と学びの設計。松岡は言語と現場の学び（RLE、子どもの英語教育）。感情や機嫌は、ここで必ず出てくる。ただし本の全部を感情に還元しない。</w:t>
       </w:r>
     </w:p>
     <w:p>
@@ -634,7 +634,7 @@
           <w:color w:val="1A365D"/>
           <w:sz w:val="24"/>
         </w:rPr>
-        <w:t>現場で使う地図（感情に還元しない）</w:t>
+        <w:t>現場で使う地図</w:t>
       </w:r>
     </w:p>
     <w:p>
@@ -649,7 +649,7 @@
           <w:color w:val="222222"/>
           <w:sz w:val="22"/>
         </w:rPr>
-        <w:t>・身体を読む——空腹、疲労、呼吸。頭の前にある。</w:t>
+        <w:t>・感じる——身体の変化や、まだ言葉になっていない感覚に気づく。</w:t>
       </w:r>
     </w:p>
     <w:p>
@@ -664,7 +664,7 @@
           <w:color w:val="222222"/>
           <w:sz w:val="22"/>
         </w:rPr>
-        <w:t>・人と場を読む——表情、空気、期待。一人では完結しない。</w:t>
+        <w:t>・読み解く——怒り、不安、空腹、疲労を、取り違えない。</w:t>
       </w:r>
     </w:p>
     <w:p>
@@ -709,7 +709,7 @@
           <w:color w:val="222222"/>
           <w:sz w:val="22"/>
         </w:rPr>
-        <w:t>・共に決める——違う知能、違う価値観のまま、合意に乗せる。</w:t>
+        <w:t>・共に決める——違う価値観のまま、合意に乗せる。</w:t>
       </w:r>
     </w:p>
     <w:p>
@@ -1283,7 +1283,7 @@
           <w:color w:val="222222"/>
           <w:sz w:val="22"/>
         </w:rPr>
-        <w:t>主著は野田。飯田・猪原・松岡が同じ本に乗る。つなぐのは多重知能である。著者表記は本人と調整する。松岡良彦は、野田のビジネスと研究のパートナーとして、著者の末尾に置く。</w:t>
+        <w:t>主著は野田。飯田・猪原・松岡が同じ本に乗る。つなぐのは、包括的な能力である。著者表記は本人と調整する。松岡良彦は、野田のビジネスと研究のパートナーとして、著者の末尾に置く。</w:t>
       </w:r>
     </w:p>
     <w:p>
@@ -1370,7 +1370,7 @@
           <w:color w:val="222222"/>
           <w:sz w:val="22"/>
         </w:rPr>
-        <w:t>認知科学者（博士）。株式会社ココロラボ代表取締役。グロービス経営大学院専任教員。MIT IDEAS Asia Pacific Regional Faculty。認知科学とリーダーシップ教育から、多重知能の側で学びを設計する。</w:t>
+        <w:t>認知科学者（博士）。株式会社ココロラボ代表取締役。グロービス経営大学院専任教員。MIT IDEAS Asia Pacific Regional Faculty。認知科学とリーダーシップ教育から、身体・感情・関係を含む学びを設計する。</w:t>
       </w:r>
     </w:p>
     <w:p>

</xml_diff>

<commit_message>
Keep emotion off the chapter titles.
Replace direct emotion-force headings with field copy, and stop using mood or 感情力 as the sign on the door.

Co-authored-by: kohnoda-glitch <kohnoda-glitch@users.noreply.github.com>
</commit_message>
<xml_diff>
--- a/writing/drafts/book-proposal/出版企画書.docx
+++ b/writing/drafts/book-proposal/出版企画書.docx
@@ -354,7 +354,7 @@
           <w:color w:val="222222"/>
           <w:sz w:val="22"/>
         </w:rPr>
-        <w:t>AIが、いわゆる「頭のよさ」を安くした。残るのは、身体、感情、対人、現場で使う言葉といった、包括的な能力である。本書はそれを、親・教師・経営者に渡す。多重知能は地図のひとつであり、本の看板ではない。感情を捨てる本でもない。</w:t>
+        <w:t>AIが、いわゆる「頭のよさ」を安くした。残るのは、身体、対人、現場で使う言葉といった、包括的な能力である。感情もそこに含まれるが、本の看板にはしない。多重知能は地図のひとつである。</w:t>
       </w:r>
     </w:p>
     <w:p>
@@ -398,7 +398,7 @@
           <w:color w:val="222222"/>
           <w:sz w:val="22"/>
         </w:rPr>
-        <w:t>・ChatGPTに「部下の気持ち」を聞くな。会いに行け。</w:t>
+        <w:t>・ChatGPTに聞くな。会いに行け。</w:t>
       </w:r>
     </w:p>
     <w:p>
@@ -428,7 +428,7 @@
           <w:color w:val="222222"/>
           <w:sz w:val="22"/>
         </w:rPr>
-        <w:t>・STEMの先に残るのは、頭のよさ以外の能力である。感情も、その一部である。</w:t>
+        <w:t>・STEMの先に残るのは、頭のよさ以外の能力である。</w:t>
       </w:r>
     </w:p>
     <w:p>
@@ -472,7 +472,7 @@
           <w:color w:val="222222"/>
           <w:sz w:val="22"/>
         </w:rPr>
-        <w:t>身体、感情、人と場。こうした力は、経営教育の議論でも長く言われてきた。教育学でも、エリート教育の見直しでも、以前から出ている。特定の大学や国際機関の名前を並べれば新しく見えるが、新しさはそこではない。本書は、その再発見を繰り返さない。書くのは、AIが論理と知識を安くしたあとに、日本の家庭・学校・職場で、どの力をどう育てるかである。</w:t>
+        <w:t>身体、人と場、内面。こうした力は、経営教育の議論でも長く言われてきた。教育学でも、エリート教育の見直しでも、以前から出ている。特定の大学や国際機関の名前を並べれば新しく見えるが、新しさはそこではない。本書は、その再発見を繰り返さない。書くのは、AIが論理と知識を安くしたあとに、日本の家庭・学校・職場で、どの力をどう育てるかである。</w:t>
       </w:r>
     </w:p>
     <w:p>
@@ -576,7 +576,7 @@
           <w:color w:val="222222"/>
           <w:sz w:val="22"/>
         </w:rPr>
-        <w:t>若手には「昭和」という言葉のアレルギーがある。だから昭和は入口のコピーに使い、本文は包括的な能力——身体、感情、人と場——で読ませる。タイトルは第一案以外でもよい。中身は変えない。</w:t>
+        <w:t>若手には「昭和」という言葉のアレルギーがある。だから昭和は入口のコピーに使い、本文は包括的な能力で読ませる。タイトルは第一案以外でもよい。中身は変えない。</w:t>
       </w:r>
     </w:p>
     <w:p>
@@ -605,7 +605,7 @@
           <w:color w:val="222222"/>
           <w:sz w:val="22"/>
         </w:rPr>
-        <w:t>3名、ないし4名をつなぐのは、感情の教科書でも、ひとつの理論の解説書でもない。頭のよさ以外の、包括的な能力である。多重知能は、その代表的な整理のひとつにすぎない。身体、対人、内面、言語、感情。IQやSTEMで測る力は、その一部でしかない。</w:t>
+        <w:t>3名、ないし4名をつなぐのは、ひとつの理論の解説書ではない。頭のよさ以外の、包括的な能力である。多重知能は、その代表的な整理のひとつにすぎない。身体、対人、内面、言語。感情もそこに入る。IQやSTEMで測る力は、その一部でしかない。</w:t>
       </w:r>
     </w:p>
     <w:p>
@@ -620,7 +620,7 @@
           <w:color w:val="222222"/>
           <w:sz w:val="22"/>
         </w:rPr>
-        <w:t>顔ぶれは、その現場にいる。飯田は身体とものづくり（身体性ロボット・人工知能）。猪原は人と集団で決めること（合意形成・特別活動）。野田は認知科学と学びの設計。松岡は言語と現場の学び（RLE、子どもの英語教育）。感情や機嫌は、ここで必ず出てくる。ただし本の全部を感情に還元しない。</w:t>
+        <w:t>顔ぶれは、その現場にいる。飯田は身体とものづくり（身体性ロボット・人工知能）。猪原は人と集団で決めること（合意形成・特別活動）。野田は認知科学と学びの設計。松岡は言語と現場の学び（RLE、子どもの英語教育）。</w:t>
       </w:r>
     </w:p>
     <w:p>
@@ -649,7 +649,7 @@
           <w:color w:val="222222"/>
           <w:sz w:val="22"/>
         </w:rPr>
-        <w:t>・感じる——身体の変化や、まだ言葉になっていない感覚に気づく。</w:t>
+        <w:t>・身体を読む——空腹、疲労、呼吸。頭の前にある。</w:t>
       </w:r>
     </w:p>
     <w:p>
@@ -664,7 +664,7 @@
           <w:color w:val="222222"/>
           <w:sz w:val="22"/>
         </w:rPr>
-        <w:t>・読み解く——怒り、不安、空腹、疲労を、取り違えない。</w:t>
+        <w:t>・場を読む——表情、空気、期待。一人では完結しない。</w:t>
       </w:r>
     </w:p>
     <w:p>
@@ -900,7 +900,7 @@
           <w:color w:val="1A365D"/>
           <w:sz w:val="24"/>
         </w:rPr>
-        <w:t>第1章　「感情的になるな」が、いちばん危ない</w:t>
+        <w:t>第1章　頭がいい人ほど、先に折れる</w:t>
       </w:r>
     </w:p>
     <w:p>
@@ -915,7 +915,7 @@
           <w:color w:val="222222"/>
           <w:sz w:val="22"/>
         </w:rPr>
-        <w:t>・ChatGPTに「部下の気持ち」を聞くな</w:t>
+        <w:t>・ChatGPTに聞くな。会いに行け</w:t>
       </w:r>
     </w:p>
     <w:p>
@@ -945,7 +945,7 @@
           <w:color w:val="222222"/>
           <w:sz w:val="22"/>
         </w:rPr>
-        <w:t>・頭がいい人ほど、先に折れる</w:t>
+        <w:t>・正しいことが、人を動かさない理由</w:t>
       </w:r>
     </w:p>
     <w:p>
@@ -959,7 +959,7 @@
           <w:color w:val="1A365D"/>
           <w:sz w:val="24"/>
         </w:rPr>
-        <w:t>第2章　AIは、お腹が空いて不機嫌になれない</w:t>
+        <w:t>第2章　AIは、お腹が空かない</w:t>
       </w:r>
     </w:p>
     <w:p>
@@ -1018,7 +1018,7 @@
           <w:color w:val="1A365D"/>
           <w:sz w:val="24"/>
         </w:rPr>
-        <w:t>第3章　あの不機嫌の正体は、だいたい空腹である</w:t>
+        <w:t>第3章　0.5秒の余白をつくる</w:t>
       </w:r>
     </w:p>
     <w:p>
@@ -1033,7 +1033,7 @@
           <w:color w:val="222222"/>
           <w:sz w:val="22"/>
         </w:rPr>
-        <w:t>・怒りと疲労を、取り違えない</w:t>
+        <w:t>・空腹を、性格だと思わない</w:t>
       </w:r>
     </w:p>
     <w:p>
@@ -1048,7 +1048,7 @@
           <w:color w:val="222222"/>
           <w:sz w:val="22"/>
         </w:rPr>
-        <w:t>・0.5秒の余白をつくる</w:t>
+        <w:t>・衝動と行動のあいだに、選択肢を置く</w:t>
       </w:r>
     </w:p>
     <w:p>
@@ -1077,7 +1077,7 @@
           <w:color w:val="1A365D"/>
           <w:sz w:val="24"/>
         </w:rPr>
-        <w:t>第4章　リーダーの機嫌が、場の頭を悪くする</w:t>
+        <w:t>第4章　リーダーの一声で、場の頭が悪くなる</w:t>
       </w:r>
     </w:p>
     <w:p>
@@ -1122,7 +1122,7 @@
           <w:color w:val="222222"/>
           <w:sz w:val="22"/>
         </w:rPr>
-        <w:t>・上機嫌の場は、設計できる</w:t>
+        <w:t>・場は、設計できる</w:t>
       </w:r>
     </w:p>
     <w:p>
@@ -1254,7 +1254,7 @@
           <w:color w:val="555555"/>
           <w:sz w:val="20"/>
         </w:rPr>
-        <w:t>各章末に、短い実践を1つ置く（身体の天気予報、感情の翻訳、驚きノート、場の感情地図、対話の問い）。理論だけで終わらせない。</w:t>
+        <w:t>各章末に、短い実践を1つ置く（身体の天気予報、言葉の翻訳、驚きノート、場の地図、対話の問い）。理論だけで終わらせない。</w:t>
       </w:r>
     </w:p>
     <w:p>
@@ -1370,7 +1370,7 @@
           <w:color w:val="222222"/>
           <w:sz w:val="22"/>
         </w:rPr>
-        <w:t>認知科学者（博士）。株式会社ココロラボ代表取締役。グロービス経営大学院専任教員。MIT IDEAS Asia Pacific Regional Faculty。認知科学とリーダーシップ教育から、身体・感情・関係を含む学びを設計する。</w:t>
+        <w:t>認知科学者（博士）。株式会社ココロラボ代表取締役。グロービス経営大学院専任教員。MIT IDEAS Asia Pacific Regional Faculty。認知科学とリーダーシップ教育から、身体・関係を含む学びを設計する。</w:t>
       </w:r>
     </w:p>
     <w:p>

</xml_diff>

<commit_message>
Rewrite the proposal in plainer Japanese.
Drop the emotion-force and MI lecture from the title section, say 端的にいうと, treat the five layers as background, and leave format, length, and price open.

Co-authored-by: kohnoda-glitch <kohnoda-glitch@users.noreply.github.com>
</commit_message>
<xml_diff>
--- a/writing/drafts/book-proposal/出版企画書.docx
+++ b/writing/drafts/book-proposal/出版企画書.docx
@@ -103,7 +103,7 @@
           <w:color w:val="222222"/>
           <w:sz w:val="22"/>
         </w:rPr>
-        <w:t>表紙の第一案は、次のコピーにする。「感情力」は手垢がついており、棚の第一案にはしない。中身が扱うのは、頭のよさだけではない包括的な能力である。多重知能は、その代表的な見取り図のひとつにすぎない。感情も、その一部として残る。</w:t>
+        <w:t>いま表紙に置くなら、これです。棚で手に取ってもらうための入口であって、中身の要約ではありません。昭和の全部を褒める本でもありません。捨ててしまった会うこと、雑談、世話、失敗の共有を、もう一度設計し直す話です。題は、棚に合わせて変えても同じ本です。</w:t>
       </w:r>
     </w:p>
     <w:p>
@@ -117,7 +117,7 @@
           <w:color w:val="1A365D"/>
           <w:sz w:val="24"/>
         </w:rPr>
-        <w:t>第一案</w:t>
+        <w:t>いまの案</w:t>
       </w:r>
     </w:p>
     <w:p>
@@ -176,22 +176,7 @@
           <w:color w:val="555555"/>
           <w:sz w:val="20"/>
         </w:rPr>
-        <w:t>昭和の全部を戻す本ではない。戻さないのは、パワハラ、飲酒の強要、理不尽な上下である。残すのは、身体を同じ場所に置くことである。ノスタルジーが先に立つなら、帯と序章でそれを否定する。</w:t>
-      </w:r>
-    </w:p>
-    <w:p>
-      <w:pPr>
-        <w:spacing w:after="160" w:before="0" w:lineRule="auto" w:line="324"/>
-        <w:ind w:firstLine="397"/>
-      </w:pPr>
-      <w:r>
-        <w:rPr>
-          <w:rFonts w:ascii="Yu Mincho" w:hAnsi="Yu Mincho" w:eastAsia="Yu Mincho"/>
-          <w:b w:val="0"/>
-          <w:color w:val="222222"/>
-          <w:sz w:val="22"/>
-        </w:rPr>
-        <w:t>第一案で進める必要はない。棚と読者に合わせて、次からも選べる。いずれも同じ本である。</w:t>
+        <w:t>戻さないのは、パワハラ、飲酒の強要、理不尽な上下です。残すのは、身体を同じ場所に置くことです。</w:t>
       </w:r>
     </w:p>
     <w:p>
@@ -220,7 +205,7 @@
           <w:color w:val="222222"/>
           <w:sz w:val="22"/>
         </w:rPr>
-        <w:t>・仕事のコミュニケーションコストは下げろ。人間のコミュニケーションコストは上げろ。（タイトルにもできる）</w:t>
+        <w:t>・仕事のコミュニケーションコストは下げろ。人間のコミュニケーションコストは上げろ。（題にもできる）</w:t>
       </w:r>
     </w:p>
     <w:p>
@@ -235,7 +220,7 @@
           <w:color w:val="222222"/>
           <w:sz w:val="22"/>
         </w:rPr>
-        <w:t>・『AIに代替されない「最後の知性」』—— データに奪われない、人と場の設計</w:t>
+        <w:t>・『AIに代替されない「最後の知性」』</w:t>
       </w:r>
     </w:p>
     <w:p>
@@ -250,7 +235,7 @@
           <w:color w:val="222222"/>
           <w:sz w:val="22"/>
         </w:rPr>
-        <w:t>・『「違和感」を無視して生きてきた大人たちへ』—— 身体の声を情報として扱う</w:t>
+        <w:t>・『「正解のない世界」で、自分を失わない技術』</w:t>
       </w:r>
     </w:p>
     <w:p>
@@ -265,67 +250,7 @@
           <w:color w:val="222222"/>
           <w:sz w:val="22"/>
         </w:rPr>
-        <w:t>・『思考停止の時代に、知性を再起動する』—— 内なる情動から軸を立て直す</w:t>
-      </w:r>
-    </w:p>
-    <w:p>
-      <w:pPr>
-        <w:spacing w:after="60" w:before="0" w:lineRule="auto" w:line="324"/>
-        <w:ind w:left="397"/>
-      </w:pPr>
-      <w:r>
-        <w:rPr>
-          <w:rFonts w:ascii="Yu Mincho" w:hAnsi="Yu Mincho" w:eastAsia="Yu Mincho"/>
-          <w:b w:val="0"/>
-          <w:color w:val="222222"/>
-          <w:sz w:val="22"/>
-        </w:rPr>
-        <w:t>・『あなたの経験値が、明日から役に立たなくなる理由』—— 内発的モチベーションの再構築</w:t>
-      </w:r>
-    </w:p>
-    <w:p>
-      <w:pPr>
-        <w:spacing w:after="60" w:before="0" w:lineRule="auto" w:line="324"/>
-        <w:ind w:left="397"/>
-      </w:pPr>
-      <w:r>
-        <w:rPr>
-          <w:rFonts w:ascii="Yu Mincho" w:hAnsi="Yu Mincho" w:eastAsia="Yu Mincho"/>
-          <w:b w:val="0"/>
-          <w:color w:val="222222"/>
-          <w:sz w:val="22"/>
-        </w:rPr>
-        <w:t>・『「正解のない世界」で、自分を失わない技術』—— 親と子の軸</w:t>
-      </w:r>
-    </w:p>
-    <w:p>
-      <w:pPr>
-        <w:spacing w:after="60" w:before="0" w:lineRule="auto" w:line="324"/>
-        <w:ind w:left="397"/>
-      </w:pPr>
-      <w:r>
-        <w:rPr>
-          <w:rFonts w:ascii="Yu Mincho" w:hAnsi="Yu Mincho" w:eastAsia="Yu Mincho"/>
-          <w:b w:val="0"/>
-          <w:color w:val="222222"/>
-          <w:sz w:val="22"/>
-        </w:rPr>
-        <w:t>・『AI時代の「人間力」とは何か』—— 知性の新定義</w:t>
-      </w:r>
-    </w:p>
-    <w:p>
-      <w:pPr>
-        <w:spacing w:after="60" w:before="0" w:lineRule="auto" w:line="324"/>
-        <w:ind w:left="397"/>
-      </w:pPr>
-      <w:r>
-        <w:rPr>
-          <w:rFonts w:ascii="Yu Mincho" w:hAnsi="Yu Mincho" w:eastAsia="Yu Mincho"/>
-          <w:b w:val="0"/>
-          <w:color w:val="222222"/>
-          <w:sz w:val="22"/>
-        </w:rPr>
-        <w:t>・『感情力の時代』—— AI・STEMの先にある人間的知性（概念名。棚の第一案にはしない）</w:t>
+        <w:t>・『「違和感」を無視して生きてきた大人たちへ』</w:t>
       </w:r>
     </w:p>
     <w:p>
@@ -339,7 +264,7 @@
           <w:color w:val="1A365D"/>
           <w:sz w:val="30"/>
         </w:rPr>
-        <w:t>2. 一枚で言うと</w:t>
+        <w:t>2. 端的にいうと</w:t>
       </w:r>
     </w:p>
     <w:p>
@@ -354,7 +279,7 @@
           <w:color w:val="222222"/>
           <w:sz w:val="22"/>
         </w:rPr>
-        <w:t>AIが、いわゆる「頭のよさ」を安くした。残るのは、身体、対人、現場で使う言葉といった、包括的な能力である。感情もそこに含まれるが、本の看板にはしない。多重知能は地図のひとつである。</w:t>
+        <w:t>仕事は速くなった。人が動かない。頭の作業はAIに渡せる。残るのは、会うことと、身体と、人と場をつくる力だ。</w:t>
       </w:r>
     </w:p>
     <w:p>
@@ -413,22 +338,7 @@
           <w:color w:val="222222"/>
           <w:sz w:val="22"/>
         </w:rPr>
-        <w:t>・昭和の全部を戻せ、ではない。捨てたはずの会う・雑談・世話・失敗の共有を、設計し直せ。</w:t>
-      </w:r>
-    </w:p>
-    <w:p>
-      <w:pPr>
-        <w:spacing w:after="60" w:before="0" w:lineRule="auto" w:line="324"/>
-        <w:ind w:left="397"/>
-      </w:pPr>
-      <w:r>
-        <w:rPr>
-          <w:rFonts w:ascii="Yu Mincho" w:hAnsi="Yu Mincho" w:eastAsia="Yu Mincho"/>
-          <w:b w:val="0"/>
-          <w:color w:val="222222"/>
-          <w:sz w:val="22"/>
-        </w:rPr>
-        <w:t>・STEMの先に残るのは、頭のよさ以外の能力である。</w:t>
+        <w:t>・昭和の全部を戻せ、ではない。会う、雑談、世話、失敗の共有を、設計し直せ。</w:t>
       </w:r>
     </w:p>
     <w:p>
@@ -457,7 +367,7 @@
           <w:color w:val="222222"/>
           <w:sz w:val="22"/>
         </w:rPr>
-        <w:t>生成AIは、資料・翻訳・議事録・コードを圧縮した。圧縮されないのは、身体で感じ、相手の状態を読み、言葉にして、関係を整え、合意に至ることである。学校では特別活動がまさにその訓練場である。家庭ではSTEM教育の親が、知識は足りている、足りないのは人間側だ、と気づき始めている。経営では、リモートとAIで仕事は回るが、人が離れ、現場の空気が読めない、という声が増えている。</w:t>
+        <w:t>資料も議事録もコードも、速く安くなった。それでも人は動かない。学校では特別活動が、人と決める訓練場になっている。家では、STEMは足りている、次は何か、という親がいる。会社では、仕事は回るが、現場の空気が読めない、という声がある。</w:t>
       </w:r>
     </w:p>
     <w:p>
@@ -472,7 +382,7 @@
           <w:color w:val="222222"/>
           <w:sz w:val="22"/>
         </w:rPr>
-        <w:t>身体、人と場、内面。こうした力は、経営教育の議論でも長く言われてきた。教育学でも、エリート教育の見直しでも、以前から出ている。特定の大学や国際機関の名前を並べれば新しく見えるが、新しさはそこではない。本書は、その再発見を繰り返さない。書くのは、AIが論理と知識を安くしたあとに、日本の家庭・学校・職場で、どの力をどう育てるかである。</w:t>
+        <w:t>身体、人と場、内面。こういう力は、経営教育でも、教育学でも、エリート教育の見直しでも、以前から言われてきた。特定の大学や国際機関の名前を出せば新しく見えるが、新しさはそこではない。この本が書くのは、AIのあとに、日本の家庭、学校、職場で何を育てるかだ。</w:t>
       </w:r>
     </w:p>
     <w:p>
@@ -487,7 +397,7 @@
           <w:color w:val="222222"/>
           <w:sz w:val="22"/>
         </w:rPr>
-        <w:t>この本は、メンタルヘルスの診断書ではない。学びと現場の設計の本である。</w:t>
+        <w:t>診断の本ではありません。学びと現場の本です。</w:t>
       </w:r>
     </w:p>
     <w:p>
@@ -516,7 +426,7 @@
           <w:color w:val="222222"/>
           <w:sz w:val="22"/>
         </w:rPr>
-        <w:t>3層を同時に取る。中心は、親でもある大人である。</w:t>
+        <w:t>中心は、親でもある大人です。</w:t>
       </w:r>
     </w:p>
     <w:p>
@@ -531,7 +441,7 @@
           <w:color w:val="222222"/>
           <w:sz w:val="22"/>
         </w:rPr>
-        <w:t>・STEM教育に関心のある親——知識は与えた。次に何を育てるか。</w:t>
+        <w:t>・STEMに関心のある親。知識は与えた。次に何を育てるか。</w:t>
       </w:r>
     </w:p>
     <w:p>
@@ -546,7 +456,7 @@
           <w:color w:val="222222"/>
           <w:sz w:val="22"/>
         </w:rPr>
-        <w:t>・教師・学校関係者——特別活動・学級経営・探究。人と合意の作り方。</w:t>
+        <w:t>・教師。特別活動、学級、探究。人と合意の作り方。</w:t>
       </w:r>
     </w:p>
     <w:p>
@@ -561,7 +471,7 @@
           <w:color w:val="222222"/>
           <w:sz w:val="22"/>
         </w:rPr>
-        <w:t>・経営者・マネジャー——AI導入後に残る、人と現場のコミュニケーション。</w:t>
+        <w:t>・経営者、マネジャー。人が離れない現場。</w:t>
       </w:r>
     </w:p>
     <w:p>
@@ -576,7 +486,7 @@
           <w:color w:val="222222"/>
           <w:sz w:val="22"/>
         </w:rPr>
-        <w:t>若手には「昭和」という言葉のアレルギーがある。だから昭和は入口のコピーに使い、本文は包括的な能力で読ませる。タイトルは第一案以外でもよい。中身は変えない。</w:t>
+        <w:t>若手には「昭和」へのアレルギーがあるので、昭和は入口に使い、本文は現場の話で読ませます。題は変えても構いません。</w:t>
       </w:r>
     </w:p>
     <w:p>
@@ -605,7 +515,7 @@
           <w:color w:val="222222"/>
           <w:sz w:val="22"/>
         </w:rPr>
-        <w:t>3名、ないし4名をつなぐのは、ひとつの理論の解説書ではない。頭のよさ以外の、包括的な能力である。多重知能は、その代表的な整理のひとつにすぎない。身体、対人、内面、言語。感情もそこに入る。IQやSTEMで測る力は、その一部でしかない。</w:t>
+        <w:t>頭のよさだけでは足りない。身体、人と場、言葉、内面。そのあたりを、この顔ぶれで書く。</w:t>
       </w:r>
     </w:p>
     <w:p>
@@ -620,7 +530,7 @@
           <w:color w:val="222222"/>
           <w:sz w:val="22"/>
         </w:rPr>
-        <w:t>顔ぶれは、その現場にいる。飯田は身体とものづくり（身体性ロボット・人工知能）。猪原は人と集団で決めること（合意形成・特別活動）。野田は認知科学と学びの設計。松岡は言語と現場の学び（RLE、子どもの英語教育）。</w:t>
+        <w:t>飯田は身体とものづくり（身体性ロボット、人工知能）。猪原は人と集団で決めること（合意形成、特別活動）。野田は認知科学と学びの設計。松岡は言語と現場の学び（RLE、子どもの英語教育）。</w:t>
       </w:r>
     </w:p>
     <w:p>
@@ -649,7 +559,7 @@
           <w:color w:val="222222"/>
           <w:sz w:val="22"/>
         </w:rPr>
-        <w:t>・身体を読む——空腹、疲労、呼吸。頭の前にある。</w:t>
+        <w:t>・身体を読む——空腹、疲労、呼吸。</w:t>
       </w:r>
     </w:p>
     <w:p>
@@ -664,7 +574,7 @@
           <w:color w:val="222222"/>
           <w:sz w:val="22"/>
         </w:rPr>
-        <w:t>・場を読む——表情、空気、期待。一人では完結しない。</w:t>
+        <w:t>・場を読む——表情、空気、期待。</w:t>
       </w:r>
     </w:p>
     <w:p>
@@ -679,7 +589,7 @@
           <w:color w:val="222222"/>
           <w:sz w:val="22"/>
         </w:rPr>
-        <w:t>・言葉にする——攻撃でも沈黙でもなく、共有できる形にする。</w:t>
+        <w:t>・言葉にする——攻撃でも沈黙でもなく。</w:t>
       </w:r>
     </w:p>
     <w:p>
@@ -694,7 +604,7 @@
           <w:color w:val="222222"/>
           <w:sz w:val="22"/>
         </w:rPr>
-        <w:t>・余白をつくる——衝動と行動のあいだに、選択肢を置く。</w:t>
+        <w:t>・余白をつくる——衝動と行動のあいだ。</w:t>
       </w:r>
     </w:p>
     <w:p>
@@ -709,7 +619,7 @@
           <w:color w:val="222222"/>
           <w:sz w:val="22"/>
         </w:rPr>
-        <w:t>・共に決める——違う価値観のまま、合意に乗せる。</w:t>
+        <w:t>・共に決める——違うまま、乗せる。</w:t>
       </w:r>
     </w:p>
     <w:p>
@@ -723,7 +633,22 @@
           <w:color w:val="1A365D"/>
           <w:sz w:val="24"/>
         </w:rPr>
-        <w:t>5つの層</w:t>
+        <w:t>学術的な背景（五つの層）</w:t>
+      </w:r>
+    </w:p>
+    <w:p>
+      <w:pPr>
+        <w:spacing w:after="160" w:before="0" w:lineRule="auto" w:line="324"/>
+        <w:ind w:firstLine="397"/>
+      </w:pPr>
+      <w:r>
+        <w:rPr>
+          <w:rFonts w:ascii="Yu Mincho" w:hAnsi="Yu Mincho" w:eastAsia="Yu Mincho"/>
+          <w:b w:val="0"/>
+          <w:color w:val="222222"/>
+          <w:sz w:val="22"/>
+        </w:rPr>
+        <w:t>本文の題や帯には出しません。裏にある整理です。身体、予測、意味、関係、集団・社会。教育や認知の議論では、多重知能のように、頭以外の力を分けて見る見方もあります。看板にはしません。</w:t>
       </w:r>
     </w:p>
     <w:p>
@@ -738,7 +663,7 @@
           <w:color w:val="222222"/>
           <w:sz w:val="22"/>
         </w:rPr>
-        <w:t>・身体——心拍、呼吸、空腹、疲労。AIにはない出発点。</w:t>
+        <w:t>・身体——心拍、呼吸、空腹、疲労。</w:t>
       </w:r>
     </w:p>
     <w:p>
@@ -753,7 +678,7 @@
           <w:color w:val="222222"/>
           <w:sz w:val="22"/>
         </w:rPr>
-        <w:t>・予測——予測と現実のずれ。驚きと好奇心。STEM学習の原動力。</w:t>
+        <w:t>・予測——予想と現実のずれ。驚き、学び。</w:t>
       </w:r>
     </w:p>
     <w:p>
@@ -768,7 +693,7 @@
           <w:color w:val="222222"/>
           <w:sz w:val="22"/>
         </w:rPr>
-        <w:t>・意味——身体信号の解釈。データに価値を与える評価機能。</w:t>
+        <w:t>・意味——何を大切にするか。</w:t>
       </w:r>
     </w:p>
     <w:p>
@@ -783,7 +708,7 @@
           <w:color w:val="222222"/>
           <w:sz w:val="22"/>
         </w:rPr>
-        <w:t>・関係——表情、態度、期待、共感。ものづくりとチームに不可欠。</w:t>
+        <w:t>・関係——表情、態度、期待。</w:t>
       </w:r>
     </w:p>
     <w:p>
@@ -798,7 +723,7 @@
           <w:color w:val="222222"/>
           <w:sz w:val="22"/>
         </w:rPr>
-        <w:t>・集団・社会——同調、制度、合意形成。特別活動と社会実装。</w:t>
+        <w:t>・集団・社会——同調、制度、合意形成。特別活動。</w:t>
       </w:r>
     </w:p>
     <w:p>
@@ -827,7 +752,7 @@
           <w:color w:val="222222"/>
           <w:sz w:val="22"/>
         </w:rPr>
-        <w:t>序章と5章と終章。見出しは、問いと現場の言葉にする。章の担当は、これから組む。第3章を誰が書くかは、いまは決めない。</w:t>
+        <w:t>序章、五章、終章。題は現場の言葉です。誰がどの章を書くかは、これから組みます。第3章は、いま決めません。</w:t>
       </w:r>
     </w:p>
     <w:p>
@@ -856,7 +781,7 @@
           <w:color w:val="222222"/>
           <w:sz w:val="22"/>
         </w:rPr>
-        <w:t>・なぜ「プログラミングができる子ども」ほど、AI時代に不安を感じるのか</w:t>
+        <w:t>・なぜ「プログラミングができる子ども」ほど、先が不安なのか</w:t>
       </w:r>
     </w:p>
     <w:p>
@@ -1254,7 +1179,7 @@
           <w:color w:val="555555"/>
           <w:sz w:val="20"/>
         </w:rPr>
-        <w:t>各章末に、短い実践を1つ置く（身体の天気予報、言葉の翻訳、驚きノート、場の地図、対話の問い）。理論だけで終わらせない。</w:t>
+        <w:t>各章の終わりに、短い実践を一つ置きます。身体の天気予報、言葉の翻訳、驚きノート、場の地図、対話の問い、など。</w:t>
       </w:r>
     </w:p>
     <w:p>
@@ -1283,7 +1208,7 @@
           <w:color w:val="222222"/>
           <w:sz w:val="22"/>
         </w:rPr>
-        <w:t>主著は野田。飯田・猪原・松岡が同じ本に乗る。つなぐのは、包括的な能力である。著者表記は本人と調整する。松岡良彦は、野田のビジネスと研究のパートナーとして、著者の末尾に置く。</w:t>
+        <w:t>主著は野田。飯田、猪原、松岡が加わる。松岡は野田のビジネスと研究のパートナーで、著者の末尾に置きます。</w:t>
       </w:r>
     </w:p>
     <w:p>
@@ -1312,7 +1237,7 @@
           <w:color w:val="222222"/>
           <w:sz w:val="22"/>
         </w:rPr>
-        <w:t>ケンブリッジ大学工学部ロボティクス教授。東京大学大学院工学系研究科教授（精密工学）。理系。身体性ロボット、身体性AI、バイオインスパイアード・ロボティクス。BIRLをケンブリッジと東京で主宰。関連書に『世界最高峰の学び』。著者表記は調整中。</w:t>
+        <w:t>ケンブリッジ大学工学部ロボティクス教授。東京大学大学院工学系研究科教授（精密工学）。身体性ロボット、身体性AI、バイオインスパイアード・ロボティクス。BIRLをケンブリッジと東京で主宰。関連書に『世界最高峰の学び』。</w:t>
       </w:r>
     </w:p>
     <w:p>
@@ -1341,7 +1266,7 @@
           <w:color w:val="222222"/>
           <w:sz w:val="22"/>
         </w:rPr>
-        <w:t>東京科学大学リベラルアーツ研究教育院教授。中央教育審議会 初等中等教育分科会 教育課程部会 特別活動ワーキンググループ専門委員（2025年9月〜2027年3月）。社会工学、意思決定、ゲーム理論、合意形成。著者表記は調整中。</w:t>
+        <w:t>東京科学大学リベラルアーツ研究教育院教授。中央教育審議会 初等中等教育分科会 教育課程部会 特別活動ワーキンググループ専門委員（2025年9月〜2027年3月）。社会工学、意思決定、ゲーム理論、合意形成。</w:t>
       </w:r>
     </w:p>
     <w:p>
@@ -1370,7 +1295,7 @@
           <w:color w:val="222222"/>
           <w:sz w:val="22"/>
         </w:rPr>
-        <w:t>認知科学者（博士）。株式会社ココロラボ代表取締役。グロービス経営大学院専任教員。MIT IDEAS Asia Pacific Regional Faculty。認知科学とリーダーシップ教育から、身体・関係を含む学びを設計する。</w:t>
+        <w:t>認知科学者（博士）。株式会社ココロラボ代表取締役。グロービス経営大学院専任教員。MIT IDEAS Asia Pacific Regional Faculty。認知科学とリーダーシップ教育。</w:t>
       </w:r>
     </w:p>
     <w:p>
@@ -1399,7 +1324,7 @@
           <w:color w:val="222222"/>
           <w:sz w:val="22"/>
         </w:rPr>
-        <w:t>野田のビジネスと研究のパートナーである。株式会社Ducks and Drakes。フィリピン・ドゥマゲテの Starting Point English Academy（SPEA）で、子どもの英語教育を現場でともに見ていた。2016年、日本認知科学会第33回大会で野田と共著発表（第二言語としての英語学習における Real Life Experience 法の提案）。</w:t>
+        <w:t>野田のビジネスと研究のパートナー。株式会社Ducks and Drakes。フィリピン・ドゥマゲテの Starting Point English Academy（SPEA）で、子どもの英語教育を現場でともに見ていた。2016年、日本認知科学会第33回大会で野田と共著発表（第二言語としての英語学習における Real Life Experience 法の提案）。</w:t>
       </w:r>
     </w:p>
     <w:p>
@@ -1418,8 +1343,8 @@
     </w:p>
     <w:p>
       <w:pPr>
-        <w:spacing w:after="60" w:before="0" w:lineRule="auto" w:line="324"/>
-        <w:ind w:left="397"/>
+        <w:spacing w:after="160" w:before="0" w:lineRule="auto" w:line="324"/>
+        <w:ind w:firstLine="397"/>
       </w:pPr>
       <w:r>
         <w:rPr>
@@ -1428,52 +1353,7 @@
           <w:color w:val="222222"/>
           <w:sz w:val="22"/>
         </w:rPr>
-        <w:t>・判型：四六判並製</w:t>
-      </w:r>
-    </w:p>
-    <w:p>
-      <w:pPr>
-        <w:spacing w:after="60" w:before="0" w:lineRule="auto" w:line="324"/>
-        <w:ind w:left="397"/>
-      </w:pPr>
-      <w:r>
-        <w:rPr>
-          <w:rFonts w:ascii="Yu Mincho" w:hAnsi="Yu Mincho" w:eastAsia="Yu Mincho"/>
-          <w:b w:val="0"/>
-          <w:color w:val="222222"/>
-          <w:sz w:val="22"/>
-        </w:rPr>
-        <w:t>・分量：240〜320ページ（目安は280ページ前後）</w:t>
-      </w:r>
-    </w:p>
-    <w:p>
-      <w:pPr>
-        <w:spacing w:after="60" w:before="0" w:lineRule="auto" w:line="324"/>
-        <w:ind w:left="397"/>
-      </w:pPr>
-      <w:r>
-        <w:rPr>
-          <w:rFonts w:ascii="Yu Mincho" w:hAnsi="Yu Mincho" w:eastAsia="Yu Mincho"/>
-          <w:b w:val="0"/>
-          <w:color w:val="222222"/>
-          <w:sz w:val="22"/>
-        </w:rPr>
-        <w:t>・価格：1,700円前後（税別）</w:t>
-      </w:r>
-    </w:p>
-    <w:p>
-      <w:pPr>
-        <w:spacing w:after="60" w:before="0" w:lineRule="auto" w:line="324"/>
-        <w:ind w:left="397"/>
-      </w:pPr>
-      <w:r>
-        <w:rPr>
-          <w:rFonts w:ascii="Yu Mincho" w:hAnsi="Yu Mincho" w:eastAsia="Yu Mincho"/>
-          <w:b w:val="0"/>
-          <w:color w:val="222222"/>
-          <w:sz w:val="22"/>
-        </w:rPr>
-        <w:t>・展開：保護者・教員向けの公開講座、鼎談、学校・企業向けの短いワーク</w:t>
+        <w:t>判型、ページ数、価格は、いま決めません。厚い本に限りません。書店で手に取ってもらえる短さも含めて、編集者と相談したいです。公開講座や鼎談は、本のあとの話です。</w:t>
       </w:r>
     </w:p>
     <w:sectPr>

</xml_diff>